<commit_message>
Fix workflow diagrams: render mermaid as PNG images in HTML and DOCX
Embed 6 workflow diagrams as images instead of placeholders.
Add zip bundle with HTML and diagrams folder for mobile viewing.

Co-authored-by: jupakulasanjay <jupakulasanjay@users.noreply.github.com>
</commit_message>
<xml_diff>
--- a/downloads/Corporate-Travel-Management-Scope.docx
+++ b/downloads/Corporate-Travel-Management-Scope.docx
@@ -1749,9 +1749,41 @@
     </w:p>
     <w:p>
       <w:r>
-        <w:t>[Workflow diagram — see HTML version for formatted document]</w:t>
+        <w:drawing>
+          <wp:inline xmlns:a="http://schemas.openxmlformats.org/drawingml/2006/main" xmlns:pic="http://schemas.openxmlformats.org/drawingml/2006/picture">
+            <wp:extent cx="5486400" cy="36585195"/>
+            <wp:docPr id="1" name="Picture 1"/>
+            <wp:cNvGraphicFramePr>
+              <a:graphicFrameLocks noChangeAspect="1"/>
+            </wp:cNvGraphicFramePr>
+            <a:graphic>
+              <a:graphicData uri="http://schemas.openxmlformats.org/drawingml/2006/picture">
+                <pic:pic>
+                  <pic:nvPicPr>
+                    <pic:cNvPr id="0" name="diagram-1.png"/>
+                    <pic:cNvPicPr/>
+                  </pic:nvPicPr>
+                  <pic:blipFill>
+                    <a:blip r:embed="rId9"/>
+                    <a:stretch>
+                      <a:fillRect/>
+                    </a:stretch>
+                  </pic:blipFill>
+                  <pic:spPr>
+                    <a:xfrm>
+                      <a:off x="0" y="0"/>
+                      <a:ext cx="5486400" cy="36585195"/>
+                    </a:xfrm>
+                    <a:prstGeom prst="rect"/>
+                  </pic:spPr>
+                </pic:pic>
+              </a:graphicData>
+            </a:graphic>
+          </wp:inline>
+        </w:drawing>
       </w:r>
     </w:p>
+    <w:p/>
     <w:p>
       <w:pPr>
         <w:pStyle w:val="Heading2"/>
@@ -1762,9 +1794,41 @@
     </w:p>
     <w:p>
       <w:r>
-        <w:t>[Workflow diagram — see HTML version for formatted document]</w:t>
+        <w:drawing>
+          <wp:inline xmlns:a="http://schemas.openxmlformats.org/drawingml/2006/main" xmlns:pic="http://schemas.openxmlformats.org/drawingml/2006/picture">
+            <wp:extent cx="5486400" cy="4044820"/>
+            <wp:docPr id="2" name="Picture 2"/>
+            <wp:cNvGraphicFramePr>
+              <a:graphicFrameLocks noChangeAspect="1"/>
+            </wp:cNvGraphicFramePr>
+            <a:graphic>
+              <a:graphicData uri="http://schemas.openxmlformats.org/drawingml/2006/picture">
+                <pic:pic>
+                  <pic:nvPicPr>
+                    <pic:cNvPr id="0" name="diagram-2.png"/>
+                    <pic:cNvPicPr/>
+                  </pic:nvPicPr>
+                  <pic:blipFill>
+                    <a:blip r:embed="rId10"/>
+                    <a:stretch>
+                      <a:fillRect/>
+                    </a:stretch>
+                  </pic:blipFill>
+                  <pic:spPr>
+                    <a:xfrm>
+                      <a:off x="0" y="0"/>
+                      <a:ext cx="5486400" cy="4044820"/>
+                    </a:xfrm>
+                    <a:prstGeom prst="rect"/>
+                  </pic:spPr>
+                </pic:pic>
+              </a:graphicData>
+            </a:graphic>
+          </wp:inline>
+        </w:drawing>
       </w:r>
     </w:p>
+    <w:p/>
     <w:p>
       <w:pPr>
         <w:pStyle w:val="Heading2"/>
@@ -4109,9 +4173,41 @@
     </w:p>
     <w:p>
       <w:r>
-        <w:t>[Workflow diagram — see HTML version for formatted document]</w:t>
+        <w:drawing>
+          <wp:inline xmlns:a="http://schemas.openxmlformats.org/drawingml/2006/main" xmlns:pic="http://schemas.openxmlformats.org/drawingml/2006/picture">
+            <wp:extent cx="5486400" cy="258924"/>
+            <wp:docPr id="3" name="Picture 3"/>
+            <wp:cNvGraphicFramePr>
+              <a:graphicFrameLocks noChangeAspect="1"/>
+            </wp:cNvGraphicFramePr>
+            <a:graphic>
+              <a:graphicData uri="http://schemas.openxmlformats.org/drawingml/2006/picture">
+                <pic:pic>
+                  <pic:nvPicPr>
+                    <pic:cNvPr id="0" name="diagram-3.png"/>
+                    <pic:cNvPicPr/>
+                  </pic:nvPicPr>
+                  <pic:blipFill>
+                    <a:blip r:embed="rId11"/>
+                    <a:stretch>
+                      <a:fillRect/>
+                    </a:stretch>
+                  </pic:blipFill>
+                  <pic:spPr>
+                    <a:xfrm>
+                      <a:off x="0" y="0"/>
+                      <a:ext cx="5486400" cy="258924"/>
+                    </a:xfrm>
+                    <a:prstGeom prst="rect"/>
+                  </pic:spPr>
+                </pic:pic>
+              </a:graphicData>
+            </a:graphic>
+          </wp:inline>
+        </w:drawing>
       </w:r>
     </w:p>
+    <w:p/>
     <w:tbl>
       <w:tblPr>
         <w:tblStyle w:val="TableGrid"/>
@@ -4604,9 +4700,41 @@
     </w:p>
     <w:p>
       <w:r>
-        <w:t>[Workflow diagram — see HTML version for formatted document]</w:t>
+        <w:drawing>
+          <wp:inline xmlns:a="http://schemas.openxmlformats.org/drawingml/2006/main" xmlns:pic="http://schemas.openxmlformats.org/drawingml/2006/picture">
+            <wp:extent cx="5486400" cy="20457459"/>
+            <wp:docPr id="4" name="Picture 4"/>
+            <wp:cNvGraphicFramePr>
+              <a:graphicFrameLocks noChangeAspect="1"/>
+            </wp:cNvGraphicFramePr>
+            <a:graphic>
+              <a:graphicData uri="http://schemas.openxmlformats.org/drawingml/2006/picture">
+                <pic:pic>
+                  <pic:nvPicPr>
+                    <pic:cNvPr id="0" name="diagram-4.png"/>
+                    <pic:cNvPicPr/>
+                  </pic:nvPicPr>
+                  <pic:blipFill>
+                    <a:blip r:embed="rId12"/>
+                    <a:stretch>
+                      <a:fillRect/>
+                    </a:stretch>
+                  </pic:blipFill>
+                  <pic:spPr>
+                    <a:xfrm>
+                      <a:off x="0" y="0"/>
+                      <a:ext cx="5486400" cy="20457459"/>
+                    </a:xfrm>
+                    <a:prstGeom prst="rect"/>
+                  </pic:spPr>
+                </pic:pic>
+              </a:graphicData>
+            </a:graphic>
+          </wp:inline>
+        </w:drawing>
       </w:r>
     </w:p>
+    <w:p/>
     <w:tbl>
       <w:tblPr>
         <w:tblStyle w:val="TableGrid"/>
@@ -4863,9 +4991,41 @@
     </w:p>
     <w:p>
       <w:r>
-        <w:t>[Workflow diagram — see HTML version for formatted document]</w:t>
+        <w:drawing>
+          <wp:inline xmlns:a="http://schemas.openxmlformats.org/drawingml/2006/main" xmlns:pic="http://schemas.openxmlformats.org/drawingml/2006/picture">
+            <wp:extent cx="5486400" cy="14171954"/>
+            <wp:docPr id="5" name="Picture 5"/>
+            <wp:cNvGraphicFramePr>
+              <a:graphicFrameLocks noChangeAspect="1"/>
+            </wp:cNvGraphicFramePr>
+            <a:graphic>
+              <a:graphicData uri="http://schemas.openxmlformats.org/drawingml/2006/picture">
+                <pic:pic>
+                  <pic:nvPicPr>
+                    <pic:cNvPr id="0" name="diagram-5.png"/>
+                    <pic:cNvPicPr/>
+                  </pic:nvPicPr>
+                  <pic:blipFill>
+                    <a:blip r:embed="rId13"/>
+                    <a:stretch>
+                      <a:fillRect/>
+                    </a:stretch>
+                  </pic:blipFill>
+                  <pic:spPr>
+                    <a:xfrm>
+                      <a:off x="0" y="0"/>
+                      <a:ext cx="5486400" cy="14171954"/>
+                    </a:xfrm>
+                    <a:prstGeom prst="rect"/>
+                  </pic:spPr>
+                </pic:pic>
+              </a:graphicData>
+            </a:graphic>
+          </wp:inline>
+        </w:drawing>
       </w:r>
     </w:p>
+    <w:p/>
     <w:tbl>
       <w:tblPr>
         <w:tblStyle w:val="TableGrid"/>
@@ -5754,9 +5914,41 @@
     </w:p>
     <w:p>
       <w:r>
-        <w:t>[Workflow diagram — see HTML version for formatted document]</w:t>
+        <w:drawing>
+          <wp:inline xmlns:a="http://schemas.openxmlformats.org/drawingml/2006/main" xmlns:pic="http://schemas.openxmlformats.org/drawingml/2006/picture">
+            <wp:extent cx="5486400" cy="4102733"/>
+            <wp:docPr id="6" name="Picture 6"/>
+            <wp:cNvGraphicFramePr>
+              <a:graphicFrameLocks noChangeAspect="1"/>
+            </wp:cNvGraphicFramePr>
+            <a:graphic>
+              <a:graphicData uri="http://schemas.openxmlformats.org/drawingml/2006/picture">
+                <pic:pic>
+                  <pic:nvPicPr>
+                    <pic:cNvPr id="0" name="diagram-6.png"/>
+                    <pic:cNvPicPr/>
+                  </pic:nvPicPr>
+                  <pic:blipFill>
+                    <a:blip r:embed="rId14"/>
+                    <a:stretch>
+                      <a:fillRect/>
+                    </a:stretch>
+                  </pic:blipFill>
+                  <pic:spPr>
+                    <a:xfrm>
+                      <a:off x="0" y="0"/>
+                      <a:ext cx="5486400" cy="4102733"/>
+                    </a:xfrm>
+                    <a:prstGeom prst="rect"/>
+                  </pic:spPr>
+                </pic:pic>
+              </a:graphicData>
+            </a:graphic>
+          </wp:inline>
+        </w:drawing>
       </w:r>
     </w:p>
+    <w:p/>
     <w:p>
       <w:r>
         <w:t>Each traveler has an independent form, approval, and booking. If itineraries diverge later, no form becomes invalid.</w:t>

</xml_diff>